<commit_message>
Xem kho làm lại theo bản mẫu chủ dự án (Kho_new, 30/09)
- Trái: danh sách kho nhóm theo khu vực, bồn nhỏ, lọc Cần xử lý / Còn hàng
  / Trống, tìm theo số phiếu, số xe. Phải: Toàn bộ kho (việc cần xử lý,
  bức tường bồn, ma trận phụ tùng, lô hàng gửi bãi) hoặc một kho (bồn lớn
  theo sức chứa, vạch mức an toàn, biểu đồ tồn theo ngày, sổ kho tháng).
- Chỉ xem; vai không thấy giá vốn thì ẩn cột giá; số phiếu mở phiếu xuất
  xe theo quyền; kho chưa khai sức chứa vẽ theo mức cao nhất trong tháng.
- CSS mẫu bọc trong .k2, lớp trùng CSS chung đổi tên k2-*; 114 khoá chữ
  mới đủ vi / lo / en (thêm thẳng vào ngon_ngu.js, không chạy lại công cụ
  sinh vì nguồn đã cũ).
- Máy chủ: dòng chờ cấp / đã khai kèm tuyến. Hợp đồng anh Toàn mục A13:
  các khoá mới API kho phải trả.

Co-Authored-By: Claude Opus 5.5 (1M context) <noreply@anthropic.com>
</commit_message>
<xml_diff>
--- a/DOCS/word/HOP_DONG_API_KHO_ANH_TOAN.docx
+++ b/DOCS/word/HOP_DONG_API_KHO_ANH_TOAN.docx
@@ -9956,6 +9956,840 @@
       </w:pPr>
       <w:r>
         <w:t>- lọc giá theo vai.</w:t>
+      </w:r>
+    </w:p>
+    <w:p>
+      <w:pPr>
+        <w:jc w:val="both"/>
+      </w:pPr>
+      <w:r>
+        <w:rPr>
+          <w:b/>
+        </w:rPr>
+        <w:t>Bổ sung 30/09 chiều — giao diện Xem kho mới</w:t>
+      </w:r>
+      <w:r>
+        <w:t xml:space="preserve"> (chủ dự án duyệt bản mẫu; màn vẽ bồn theo sức chứa, vạch mức an toàn, nhóm kho theo khu vực, sổ kho cả tháng, biểu đồ tồn theo ngày). Xin anh trả thêm các khoá sau. Bản tạm bên trang kế toán đã trả đúng các khoá này để anh đối chiếu.</w:t>
+      </w:r>
+    </w:p>
+    <w:tbl>
+      <w:tblPr>
+        <w:tblStyle w:val="LightGrid-Accent1"/>
+        <w:tblW w:type="auto" w:w="0"/>
+        <w:tblLook w:firstColumn="1" w:firstRow="1" w:lastColumn="0" w:lastRow="0" w:noHBand="0" w:noVBand="1" w:val="04A0"/>
+      </w:tblPr>
+      <w:tblGrid>
+        <w:gridCol w:w="2160"/>
+        <w:gridCol w:w="2160"/>
+        <w:gridCol w:w="2160"/>
+        <w:gridCol w:w="2160"/>
+      </w:tblGrid>
+      <w:tr>
+        <w:tc>
+          <w:tcPr>
+            <w:tcW w:type="dxa" w:w="2160"/>
+          </w:tcPr>
+          <w:p>
+            <w:r>
+              <w:rPr>
+                <w:b/>
+              </w:rPr>
+            </w:r>
+            <w:r>
+              <w:rPr>
+                <w:b/>
+              </w:rPr>
+              <w:t>Khối</w:t>
+            </w:r>
+          </w:p>
+        </w:tc>
+        <w:tc>
+          <w:tcPr>
+            <w:tcW w:type="dxa" w:w="2160"/>
+          </w:tcPr>
+          <w:p>
+            <w:r>
+              <w:rPr>
+                <w:b/>
+              </w:rPr>
+            </w:r>
+            <w:r>
+              <w:rPr>
+                <w:b/>
+              </w:rPr>
+              <w:t>Khoá thêm</w:t>
+            </w:r>
+          </w:p>
+        </w:tc>
+        <w:tc>
+          <w:tcPr>
+            <w:tcW w:type="dxa" w:w="2160"/>
+          </w:tcPr>
+          <w:p>
+            <w:r>
+              <w:rPr>
+                <w:b/>
+              </w:rPr>
+            </w:r>
+            <w:r>
+              <w:rPr>
+                <w:b/>
+              </w:rPr>
+              <w:t>Kiểu</w:t>
+            </w:r>
+          </w:p>
+        </w:tc>
+        <w:tc>
+          <w:tcPr>
+            <w:tcW w:type="dxa" w:w="2160"/>
+          </w:tcPr>
+          <w:p>
+            <w:r>
+              <w:rPr>
+                <w:b/>
+              </w:rPr>
+            </w:r>
+            <w:r>
+              <w:rPr>
+                <w:b/>
+              </w:rPr>
+              <w:t>Ý nghĩa</w:t>
+            </w:r>
+          </w:p>
+        </w:tc>
+      </w:tr>
+      <w:tr>
+        <w:tc>
+          <w:tcPr>
+            <w:tcW w:type="dxa" w:w="2160"/>
+          </w:tcPr>
+          <w:p>
+            <w:r/>
+            <w:r>
+              <w:rPr>
+                <w:rFonts w:ascii="Consolas" w:hAnsi="Consolas"/>
+                <w:sz w:val="19"/>
+              </w:rPr>
+              <w:t>nhien_lieu[]</w:t>
+            </w:r>
+          </w:p>
+        </w:tc>
+        <w:tc>
+          <w:tcPr>
+            <w:tcW w:type="dxa" w:w="2160"/>
+          </w:tcPr>
+          <w:p>
+            <w:r/>
+            <w:r>
+              <w:rPr>
+                <w:rFonts w:ascii="Consolas" w:hAnsi="Consolas"/>
+                <w:sz w:val="19"/>
+              </w:rPr>
+              <w:t>capacity_l</w:t>
+            </w:r>
+          </w:p>
+        </w:tc>
+        <w:tc>
+          <w:tcPr>
+            <w:tcW w:type="dxa" w:w="2160"/>
+          </w:tcPr>
+          <w:p>
+            <w:r/>
+            <w:r>
+              <w:t xml:space="preserve">số hoặc </w:t>
+            </w:r>
+            <w:r>
+              <w:rPr>
+                <w:rFonts w:ascii="Consolas" w:hAnsi="Consolas"/>
+                <w:sz w:val="19"/>
+              </w:rPr>
+              <w:t>null</w:t>
+            </w:r>
+          </w:p>
+        </w:tc>
+        <w:tc>
+          <w:tcPr>
+            <w:tcW w:type="dxa" w:w="2160"/>
+          </w:tcPr>
+          <w:p>
+            <w:r/>
+            <w:r>
+              <w:t xml:space="preserve">sức chứa bồn (lít). </w:t>
+            </w:r>
+            <w:r>
+              <w:rPr>
+                <w:rFonts w:ascii="Consolas" w:hAnsi="Consolas"/>
+                <w:sz w:val="19"/>
+              </w:rPr>
+              <w:t>null</w:t>
+            </w:r>
+            <w:r>
+              <w:t xml:space="preserve"> = kho chưa khai → màn vẽ bồn theo mức cao nhất trong tháng, không có phần trăm</w:t>
+            </w:r>
+          </w:p>
+        </w:tc>
+      </w:tr>
+      <w:tr>
+        <w:tc>
+          <w:tcPr>
+            <w:tcW w:type="dxa" w:w="2160"/>
+          </w:tcPr>
+          <w:p>
+            <w:r/>
+            <w:r>
+              <w:rPr>
+                <w:rFonts w:ascii="Consolas" w:hAnsi="Consolas"/>
+                <w:sz w:val="19"/>
+              </w:rPr>
+              <w:t>nhien_lieu[]</w:t>
+            </w:r>
+          </w:p>
+        </w:tc>
+        <w:tc>
+          <w:tcPr>
+            <w:tcW w:type="dxa" w:w="2160"/>
+          </w:tcPr>
+          <w:p>
+            <w:r/>
+            <w:r>
+              <w:rPr>
+                <w:rFonts w:ascii="Consolas" w:hAnsi="Consolas"/>
+                <w:sz w:val="19"/>
+              </w:rPr>
+              <w:t>safety_l</w:t>
+            </w:r>
+          </w:p>
+        </w:tc>
+        <w:tc>
+          <w:tcPr>
+            <w:tcW w:type="dxa" w:w="2160"/>
+          </w:tcPr>
+          <w:p>
+            <w:r/>
+            <w:r>
+              <w:t xml:space="preserve">số hoặc </w:t>
+            </w:r>
+            <w:r>
+              <w:rPr>
+                <w:rFonts w:ascii="Consolas" w:hAnsi="Consolas"/>
+                <w:sz w:val="19"/>
+              </w:rPr>
+              <w:t>null</w:t>
+            </w:r>
+          </w:p>
+        </w:tc>
+        <w:tc>
+          <w:tcPr>
+            <w:tcW w:type="dxa" w:w="2160"/>
+          </w:tcPr>
+          <w:p>
+            <w:r/>
+            <w:r>
+              <w:t>mức an toàn tối thiểu (lít). Còn lại có thể cấp (</w:t>
+            </w:r>
+            <w:r>
+              <w:rPr>
+                <w:rFonts w:ascii="Consolas" w:hAnsi="Consolas"/>
+                <w:sz w:val="19"/>
+              </w:rPr>
+              <w:t>tồn − chờ cấp − đã khai</w:t>
+            </w:r>
+            <w:r>
+              <w:t xml:space="preserve">) thấp hơn số này thì màn báo đỏ. </w:t>
+            </w:r>
+            <w:r>
+              <w:rPr>
+                <w:rFonts w:ascii="Consolas" w:hAnsi="Consolas"/>
+                <w:sz w:val="19"/>
+              </w:rPr>
+              <w:t>null</w:t>
+            </w:r>
+            <w:r>
+              <w:t xml:space="preserve"> = không báo. Luật: </w:t>
+            </w:r>
+            <w:r>
+              <w:rPr>
+                <w:rFonts w:ascii="Consolas" w:hAnsi="Consolas"/>
+                <w:sz w:val="19"/>
+              </w:rPr>
+              <w:t>0 ≤ safety_l ≤ capacity_l</w:t>
+            </w:r>
+          </w:p>
+        </w:tc>
+      </w:tr>
+      <w:tr>
+        <w:tc>
+          <w:tcPr>
+            <w:tcW w:type="dxa" w:w="2160"/>
+          </w:tcPr>
+          <w:p>
+            <w:r/>
+            <w:r>
+              <w:rPr>
+                <w:rFonts w:ascii="Consolas" w:hAnsi="Consolas"/>
+                <w:sz w:val="19"/>
+              </w:rPr>
+              <w:t>nhien_lieu[]</w:t>
+            </w:r>
+          </w:p>
+        </w:tc>
+        <w:tc>
+          <w:tcPr>
+            <w:tcW w:type="dxa" w:w="2160"/>
+          </w:tcPr>
+          <w:p>
+            <w:r/>
+            <w:r>
+              <w:rPr>
+                <w:rFonts w:ascii="Consolas" w:hAnsi="Consolas"/>
+                <w:sz w:val="19"/>
+              </w:rPr>
+              <w:t>region</w:t>
+            </w:r>
+          </w:p>
+        </w:tc>
+        <w:tc>
+          <w:tcPr>
+            <w:tcW w:type="dxa" w:w="2160"/>
+          </w:tcPr>
+          <w:p>
+            <w:r/>
+            <w:r>
+              <w:t xml:space="preserve">chuỗi hoặc </w:t>
+            </w:r>
+            <w:r>
+              <w:rPr>
+                <w:rFonts w:ascii="Consolas" w:hAnsi="Consolas"/>
+                <w:sz w:val="19"/>
+              </w:rPr>
+              <w:t>null</w:t>
+            </w:r>
+          </w:p>
+        </w:tc>
+        <w:tc>
+          <w:tcPr>
+            <w:tcW w:type="dxa" w:w="2160"/>
+          </w:tcPr>
+          <w:p>
+            <w:r/>
+            <w:r>
+              <w:t xml:space="preserve">khu vực để nhóm kho: </w:t>
+            </w:r>
+            <w:r>
+              <w:rPr>
+                <w:rFonts w:ascii="Consolas" w:hAnsi="Consolas"/>
+                <w:sz w:val="19"/>
+              </w:rPr>
+              <w:t>Thà Bốc</w:t>
+            </w:r>
+            <w:r>
+              <w:t xml:space="preserve">, </w:t>
+            </w:r>
+            <w:r>
+              <w:rPr>
+                <w:rFonts w:ascii="Consolas" w:hAnsi="Consolas"/>
+                <w:sz w:val="19"/>
+              </w:rPr>
+              <w:t>Thakhek</w:t>
+            </w:r>
+            <w:r>
+              <w:t xml:space="preserve">, </w:t>
+            </w:r>
+            <w:r>
+              <w:rPr>
+                <w:rFonts w:ascii="Consolas" w:hAnsi="Consolas"/>
+                <w:sz w:val="19"/>
+              </w:rPr>
+              <w:t>Viêng Chăn</w:t>
+            </w:r>
+            <w:r>
+              <w:t xml:space="preserve">… </w:t>
+            </w:r>
+            <w:r>
+              <w:rPr>
+                <w:rFonts w:ascii="Consolas" w:hAnsi="Consolas"/>
+                <w:sz w:val="19"/>
+              </w:rPr>
+              <w:t>null</w:t>
+            </w:r>
+            <w:r>
+              <w:t xml:space="preserve"> = màn xếp vào "Việt Nam" (nếu </w:t>
+            </w:r>
+            <w:r>
+              <w:rPr>
+                <w:rFonts w:ascii="Consolas" w:hAnsi="Consolas"/>
+                <w:sz w:val="19"/>
+              </w:rPr>
+              <w:t>country = VN</w:t>
+            </w:r>
+            <w:r>
+              <w:t>) hoặc "Khu vực khác"</w:t>
+            </w:r>
+          </w:p>
+        </w:tc>
+      </w:tr>
+      <w:tr>
+        <w:tc>
+          <w:tcPr>
+            <w:tcW w:type="dxa" w:w="2160"/>
+          </w:tcPr>
+          <w:p>
+            <w:r/>
+            <w:r>
+              <w:rPr>
+                <w:rFonts w:ascii="Consolas" w:hAnsi="Consolas"/>
+                <w:sz w:val="19"/>
+              </w:rPr>
+              <w:t>nhien_lieu[]</w:t>
+            </w:r>
+          </w:p>
+        </w:tc>
+        <w:tc>
+          <w:tcPr>
+            <w:tcW w:type="dxa" w:w="2160"/>
+          </w:tcPr>
+          <w:p>
+            <w:r/>
+            <w:r>
+              <w:rPr>
+                <w:rFonts w:ascii="Consolas" w:hAnsi="Consolas"/>
+                <w:sz w:val="19"/>
+              </w:rPr>
+              <w:t>address</w:t>
+            </w:r>
+          </w:p>
+        </w:tc>
+        <w:tc>
+          <w:tcPr>
+            <w:tcW w:type="dxa" w:w="2160"/>
+          </w:tcPr>
+          <w:p>
+            <w:r/>
+            <w:r>
+              <w:t xml:space="preserve">chuỗi hoặc </w:t>
+            </w:r>
+            <w:r>
+              <w:rPr>
+                <w:rFonts w:ascii="Consolas" w:hAnsi="Consolas"/>
+                <w:sz w:val="19"/>
+              </w:rPr>
+              <w:t>null</w:t>
+            </w:r>
+          </w:p>
+        </w:tc>
+        <w:tc>
+          <w:tcPr>
+            <w:tcW w:type="dxa" w:w="2160"/>
+          </w:tcPr>
+          <w:p>
+            <w:r/>
+            <w:r>
+              <w:t>địa chỉ kho</w:t>
+            </w:r>
+          </w:p>
+        </w:tc>
+      </w:tr>
+      <w:tr>
+        <w:tc>
+          <w:tcPr>
+            <w:tcW w:type="dxa" w:w="2160"/>
+          </w:tcPr>
+          <w:p>
+            <w:r/>
+            <w:r>
+              <w:rPr>
+                <w:rFonts w:ascii="Consolas" w:hAnsi="Consolas"/>
+                <w:sz w:val="19"/>
+              </w:rPr>
+              <w:t>nhien_lieu[]</w:t>
+            </w:r>
+          </w:p>
+        </w:tc>
+        <w:tc>
+          <w:tcPr>
+            <w:tcW w:type="dxa" w:w="2160"/>
+          </w:tcPr>
+          <w:p>
+            <w:r/>
+            <w:r>
+              <w:rPr>
+                <w:rFonts w:ascii="Consolas" w:hAnsi="Consolas"/>
+                <w:sz w:val="19"/>
+              </w:rPr>
+              <w:t>kho_goc</w:t>
+            </w:r>
+          </w:p>
+        </w:tc>
+        <w:tc>
+          <w:tcPr>
+            <w:tcW w:type="dxa" w:w="2160"/>
+          </w:tcPr>
+          <w:p>
+            <w:r/>
+            <w:r>
+              <w:t>bool</w:t>
+            </w:r>
+          </w:p>
+        </w:tc>
+        <w:tc>
+          <w:tcPr>
+            <w:tcW w:type="dxa" w:w="2160"/>
+          </w:tcPr>
+          <w:p>
+            <w:r/>
+            <w:r>
+              <w:rPr>
+                <w:rFonts w:ascii="Consolas" w:hAnsi="Consolas"/>
+                <w:sz w:val="19"/>
+              </w:rPr>
+              <w:t>true</w:t>
+            </w:r>
+            <w:r>
+              <w:t xml:space="preserve"> cho </w:t>
+            </w:r>
+            <w:r>
+              <w:rPr>
+                <w:b/>
+              </w:rPr>
+              <w:t>đúng một</w:t>
+            </w:r>
+            <w:r>
+              <w:t xml:space="preserve"> kho: kho Thà Bốc, nơi có kho phụ tùng và bãi hàng khách gửi. Màn gắn phụ tùng và hàng gửi bãi vào kho này</w:t>
+            </w:r>
+          </w:p>
+        </w:tc>
+      </w:tr>
+      <w:tr>
+        <w:tc>
+          <w:tcPr>
+            <w:tcW w:type="dxa" w:w="2160"/>
+          </w:tcPr>
+          <w:p>
+            <w:r/>
+            <w:r>
+              <w:rPr>
+                <w:rFonts w:ascii="Consolas" w:hAnsi="Consolas"/>
+                <w:sz w:val="19"/>
+              </w:rPr>
+              <w:t>nhien_lieu[]</w:t>
+            </w:r>
+          </w:p>
+        </w:tc>
+        <w:tc>
+          <w:tcPr>
+            <w:tcW w:type="dxa" w:w="2160"/>
+          </w:tcPr>
+          <w:p>
+            <w:r/>
+            <w:r>
+              <w:rPr>
+                <w:rFonts w:ascii="Consolas" w:hAnsi="Consolas"/>
+                <w:sz w:val="19"/>
+              </w:rPr>
+              <w:t>ton_dau</w:t>
+            </w:r>
+          </w:p>
+        </w:tc>
+        <w:tc>
+          <w:tcPr>
+            <w:tcW w:type="dxa" w:w="2160"/>
+          </w:tcPr>
+          <w:p>
+            <w:r/>
+            <w:r>
+              <w:t>số</w:t>
+            </w:r>
+          </w:p>
+        </w:tc>
+        <w:tc>
+          <w:tcPr>
+            <w:tcW w:type="dxa" w:w="2160"/>
+          </w:tcPr>
+          <w:p>
+            <w:r/>
+            <w:r>
+              <w:t xml:space="preserve">tồn </w:t>
+            </w:r>
+            <w:r>
+              <w:rPr>
+                <w:b/>
+              </w:rPr>
+              <w:t>đầu tháng</w:t>
+            </w:r>
+            <w:r>
+              <w:t xml:space="preserve"> (lít) = Σ nhập − Σ xuất của mọi lần </w:t>
+            </w:r>
+            <w:r>
+              <w:rPr>
+                <w:b/>
+              </w:rPr>
+              <w:t>trước</w:t>
+            </w:r>
+            <w:r>
+              <w:t xml:space="preserve"> ngày 1 của tháng</w:t>
+            </w:r>
+          </w:p>
+        </w:tc>
+      </w:tr>
+      <w:tr>
+        <w:tc>
+          <w:tcPr>
+            <w:tcW w:type="dxa" w:w="2160"/>
+          </w:tcPr>
+          <w:p>
+            <w:r/>
+            <w:r>
+              <w:rPr>
+                <w:rFonts w:ascii="Consolas" w:hAnsi="Consolas"/>
+                <w:sz w:val="19"/>
+              </w:rPr>
+              <w:t>nhien_lieu[]</w:t>
+            </w:r>
+          </w:p>
+        </w:tc>
+        <w:tc>
+          <w:tcPr>
+            <w:tcW w:type="dxa" w:w="2160"/>
+          </w:tcPr>
+          <w:p>
+            <w:r/>
+            <w:r>
+              <w:rPr>
+                <w:rFonts w:ascii="Consolas" w:hAnsi="Consolas"/>
+                <w:sz w:val="19"/>
+              </w:rPr>
+              <w:t>so_thang[]</w:t>
+            </w:r>
+          </w:p>
+        </w:tc>
+        <w:tc>
+          <w:tcPr>
+            <w:tcW w:type="dxa" w:w="2160"/>
+          </w:tcPr>
+          <w:p>
+            <w:r/>
+            <w:r>
+              <w:t>mảng</w:t>
+            </w:r>
+          </w:p>
+        </w:tc>
+        <w:tc>
+          <w:tcPr>
+            <w:tcW w:type="dxa" w:w="2160"/>
+          </w:tcPr>
+          <w:p>
+            <w:r/>
+            <w:r>
+              <w:rPr>
+                <w:b/>
+              </w:rPr>
+              <w:t>mọi</w:t>
+            </w:r>
+            <w:r>
+              <w:t xml:space="preserve"> lần nhập / xuất </w:t>
+            </w:r>
+            <w:r>
+              <w:rPr>
+                <w:b/>
+              </w:rPr>
+              <w:t>trong tháng</w:t>
+            </w:r>
+            <w:r>
+              <w:t xml:space="preserve">, </w:t>
+            </w:r>
+            <w:r>
+              <w:rPr>
+                <w:b/>
+              </w:rPr>
+              <w:t>cũ trước</w:t>
+            </w:r>
+            <w:r>
+              <w:t>: `{ngay, kind: "in"</w:t>
+            </w:r>
+          </w:p>
+        </w:tc>
+      </w:tr>
+      <w:tr>
+        <w:tc>
+          <w:tcPr>
+            <w:tcW w:type="dxa" w:w="2160"/>
+          </w:tcPr>
+          <w:p>
+            <w:r/>
+            <w:r>
+              <w:rPr>
+                <w:rFonts w:ascii="Consolas" w:hAnsi="Consolas"/>
+                <w:sz w:val="19"/>
+              </w:rPr>
+              <w:t>phu_tung[]</w:t>
+            </w:r>
+          </w:p>
+        </w:tc>
+        <w:tc>
+          <w:tcPr>
+            <w:tcW w:type="dxa" w:w="2160"/>
+          </w:tcPr>
+          <w:p>
+            <w:r/>
+            <w:r>
+              <w:rPr>
+                <w:rFonts w:ascii="Consolas" w:hAnsi="Consolas"/>
+                <w:sz w:val="19"/>
+              </w:rPr>
+              <w:t>ton_dau</w:t>
+            </w:r>
+            <w:r>
+              <w:t xml:space="preserve">, </w:t>
+            </w:r>
+            <w:r>
+              <w:rPr>
+                <w:rFonts w:ascii="Consolas" w:hAnsi="Consolas"/>
+                <w:sz w:val="19"/>
+              </w:rPr>
+              <w:t>so_thang[]</w:t>
+            </w:r>
+          </w:p>
+        </w:tc>
+        <w:tc>
+          <w:tcPr>
+            <w:tcW w:type="dxa" w:w="2160"/>
+          </w:tcPr>
+          <w:p>
+            <w:r/>
+            <w:r>
+              <w:t>như trên</w:t>
+            </w:r>
+          </w:p>
+        </w:tc>
+        <w:tc>
+          <w:tcPr>
+            <w:tcW w:type="dxa" w:w="2160"/>
+          </w:tcPr>
+          <w:p>
+            <w:r/>
+            <w:r>
+              <w:rPr>
+                <w:rFonts w:ascii="Consolas" w:hAnsi="Consolas"/>
+                <w:sz w:val="19"/>
+              </w:rPr>
+              <w:t>so_thang[]</w:t>
+            </w:r>
+            <w:r>
+              <w:t xml:space="preserve">: </w:t>
+            </w:r>
+            <w:r>
+              <w:rPr>
+                <w:rFonts w:ascii="Consolas" w:hAnsi="Consolas"/>
+                <w:sz w:val="19"/>
+              </w:rPr>
+              <w:t>{ngay, kind, qty, doc_no, truck_no, gia}</w:t>
+            </w:r>
+            <w:r>
+              <w:t xml:space="preserve"> trong tháng, cũ trước</w:t>
+            </w:r>
+          </w:p>
+        </w:tc>
+      </w:tr>
+    </w:tbl>
+    <w:p/>
+    <w:p>
+      <w:pPr>
+        <w:pStyle w:val="ListBullet"/>
+      </w:pPr>
+      <w:r>
+        <w:t xml:space="preserve">Kiểm: với mọi kho, </w:t>
+      </w:r>
+      <w:r>
+        <w:rPr>
+          <w:rFonts w:ascii="Consolas" w:hAnsi="Consolas"/>
+          <w:sz w:val="19"/>
+        </w:rPr>
+        <w:t>ton_dau + nhap_thang − xuat_thang</w:t>
+      </w:r>
+      <w:r>
+        <w:t xml:space="preserve"> phải bằng tồn cuối tháng (tháng hiện tại thì bằng </w:t>
+      </w:r>
+      <w:r>
+        <w:rPr>
+          <w:rFonts w:ascii="Consolas" w:hAnsi="Consolas"/>
+          <w:sz w:val="19"/>
+        </w:rPr>
+        <w:t>ton_lit</w:t>
+      </w:r>
+      <w:r>
+        <w:t>). Bản tạm đã đạt trên dữ liệu thử 30/09.</w:t>
+      </w:r>
+    </w:p>
+    <w:p>
+      <w:pPr>
+        <w:pStyle w:val="ListBullet"/>
+      </w:pPr>
+      <w:r>
+        <w:t xml:space="preserve">Ai khai </w:t>
+      </w:r>
+      <w:r>
+        <w:rPr>
+          <w:rFonts w:ascii="Consolas" w:hAnsi="Consolas"/>
+          <w:sz w:val="19"/>
+        </w:rPr>
+        <w:t>capacity_l</w:t>
+      </w:r>
+      <w:r>
+        <w:t xml:space="preserve">, </w:t>
+      </w:r>
+      <w:r>
+        <w:rPr>
+          <w:rFonts w:ascii="Consolas" w:hAnsi="Consolas"/>
+          <w:sz w:val="19"/>
+        </w:rPr>
+        <w:t>safety_l</w:t>
+      </w:r>
+      <w:r>
+        <w:t xml:space="preserve">, </w:t>
+      </w:r>
+      <w:r>
+        <w:rPr>
+          <w:rFonts w:ascii="Consolas" w:hAnsi="Consolas"/>
+          <w:sz w:val="19"/>
+        </w:rPr>
+        <w:t>region</w:t>
+      </w:r>
+      <w:r>
+        <w:t xml:space="preserve">: </w:t>
+      </w:r>
+      <w:r>
+        <w:rPr>
+          <w:b/>
+        </w:rPr>
+        <w:t>bên kho</w:t>
+      </w:r>
+      <w:r>
+        <w:t xml:space="preserve"> (danh mục kho của anh). Bản tạm đang cho Sếp / KT kho xăng dầu khai ở màn Điểm đổ nhiên liệu.</w:t>
+      </w:r>
+    </w:p>
+    <w:p>
+      <w:pPr>
+        <w:pStyle w:val="ListBullet"/>
+      </w:pPr>
+      <w:r>
+        <w:rPr>
+          <w:rFonts w:ascii="Consolas" w:hAnsi="Consolas"/>
+          <w:sz w:val="19"/>
+        </w:rPr>
+        <w:t>gan_day</w:t>
+      </w:r>
+      <w:r>
+        <w:t xml:space="preserve"> giữ nguyên: bên em vẫn dùng cho hàng gửi bãi, và để chạy được với máy chưa có </w:t>
+      </w:r>
+      <w:r>
+        <w:rPr>
+          <w:rFonts w:ascii="Consolas" w:hAnsi="Consolas"/>
+          <w:sz w:val="19"/>
+        </w:rPr>
+        <w:t>so_thang</w:t>
+      </w:r>
+      <w:r>
+        <w:t>.</w:t>
       </w:r>
     </w:p>
     <w:p>

</xml_diff>